<commit_message>
Docs: headers are read under the current scope (diagram, scope table, report)
Co-Authored-By: Claude Opus 5.5 <noreply@anthropic.com>
</commit_message>
<xml_diff>
--- a/docs/Lighthouse_Evaluation_Report_HE.docx
+++ b/docs/Lighthouse_Evaluation_Report_HE.docx
@@ -4129,7 +4129,7 @@
                 <w:szCs w:val="19"/>
                 <w:rtl/>
               </w:rPr>
-              <w:t xml:space="preserve">בדיקת SPF, DKIM ו-DMARC מכותרות ההודעה, אם תאושר הרשאת גישה רחבה יותר</w:t>
+              <w:t xml:space="preserve">בדיקת SPF, DKIM ו-DMARC מכותרות ההודעה. בוצע בהמשך: התברר שההרשאה הקיימת מספיקה לקריאת הכותרות</w:t>
             </w:r>
           </w:p>
         </w:tc>
@@ -4198,7 +4198,7 @@
                 <w:szCs w:val="19"/>
                 <w:rtl/>
               </w:rPr>
-              <w:t xml:space="preserve">גבוה</w:t>
+              <w:t xml:space="preserve">נמוך</w:t>
             </w:r>
           </w:p>
         </w:tc>

</xml_diff>